<commit_message>
fix: fixed with Hope
</commit_message>
<xml_diff>
--- a/docs/report/report.docx
+++ b/docs/report/report.docx
@@ -258,34 +258,20 @@
           <w:rFonts w:hint="default" w:ascii="Times New Roman" w:hAnsi="Times New Roman" w:cs="Times New Roman"/>
           <w:lang w:val="ru-RU"/>
         </w:rPr>
-        <w:t>Саранча</w:t>
+        <w:t>Саранча Павел</w:t>
+      </w:r>
+      <w:r>
+        <w:rPr>
+          <w:rFonts w:hint="default" w:ascii="Times New Roman" w:hAnsi="Times New Roman" w:cs="Times New Roman"/>
+        </w:rPr>
+        <w:t xml:space="preserve"> </w:t>
       </w:r>
       <w:r>
         <w:rPr>
           <w:rFonts w:hint="default" w:ascii="Times New Roman" w:hAnsi="Times New Roman" w:cs="Times New Roman"/>
           <w:lang w:val="ru-RU"/>
         </w:rPr>
-        <w:t xml:space="preserve"> Павел</w:t>
-      </w:r>
-      <w:r>
-        <w:rPr>
-          <w:rFonts w:hint="default" w:ascii="Times New Roman" w:hAnsi="Times New Roman" w:cs="Times New Roman"/>
-        </w:rPr>
-        <w:t xml:space="preserve"> </w:t>
-      </w:r>
-      <w:r>
-        <w:rPr>
-          <w:rFonts w:hint="default" w:ascii="Times New Roman" w:hAnsi="Times New Roman" w:cs="Times New Roman"/>
-          <w:lang w:val="ru-RU"/>
-        </w:rPr>
-        <w:t>Алексан</w:t>
-      </w:r>
-      <w:r>
-        <w:rPr>
-          <w:rFonts w:hint="default" w:ascii="Times New Roman" w:hAnsi="Times New Roman" w:cs="Times New Roman"/>
-          <w:lang w:val="ru-RU"/>
-        </w:rPr>
-        <w:t>рович</w:t>
+        <w:t>Алексанрович</w:t>
       </w:r>
     </w:p>
     <w:p>
@@ -572,6 +558,7 @@
           <w:lang w:val="en-US"/>
         </w:rPr>
       </w:pPr>
+      <w:bookmarkStart w:id="1" w:name="_GoBack"/>
       <w:r>
         <w:rPr>
           <w:rFonts w:ascii="SimSun" w:hAnsi="SimSun" w:eastAsia="SimSun" w:cs="SimSun"/>
@@ -580,9 +567,9 @@
         </w:rPr>
         <w:drawing>
           <wp:inline distT="0" distB="0" distL="114300" distR="114300">
-            <wp:extent cx="5935345" cy="3054350"/>
-            <wp:effectExtent l="0" t="0" r="8255" b="12700"/>
-            <wp:docPr id="2" name="Изображение 21" descr="IMG_256"/>
+            <wp:extent cx="5942965" cy="8179435"/>
+            <wp:effectExtent l="0" t="0" r="635" b="4445"/>
+            <wp:docPr id="1" name="Изображение 1" descr="IMG_256"/>
             <wp:cNvGraphicFramePr>
               <a:graphicFrameLocks xmlns:a="http://schemas.openxmlformats.org/drawingml/2006/main" noChangeAspect="1"/>
             </wp:cNvGraphicFramePr>
@@ -590,7 +577,7 @@
               <a:graphicData uri="http://schemas.openxmlformats.org/drawingml/2006/picture">
                 <pic:pic xmlns:pic="http://schemas.openxmlformats.org/drawingml/2006/picture">
                   <pic:nvPicPr>
-                    <pic:cNvPr id="2" name="Изображение 21" descr="IMG_256"/>
+                    <pic:cNvPr id="1" name="Изображение 1" descr="IMG_256"/>
                     <pic:cNvPicPr>
                       <a:picLocks noChangeAspect="1"/>
                     </pic:cNvPicPr>
@@ -604,7 +591,7 @@
                   <pic:spPr>
                     <a:xfrm>
                       <a:off x="0" y="0"/>
-                      <a:ext cx="5935345" cy="3054350"/>
+                      <a:ext cx="5942965" cy="8179435"/>
                     </a:xfrm>
                     <a:prstGeom prst="rect">
                       <a:avLst/>
@@ -620,6 +607,7 @@
           </wp:inline>
         </w:drawing>
       </w:r>
+      <w:bookmarkEnd w:id="1"/>
     </w:p>
     <w:p>
       <w:pPr>
@@ -923,6 +911,7 @@
     <w:p>
       <w:pPr>
         <w:numPr>
+          <w:ilvl w:val="0"/>
           <w:numId w:val="0"/>
         </w:numPr>
         <w:ind w:leftChars="0"/>
@@ -1142,6 +1131,7 @@
     <w:p>
       <w:pPr>
         <w:numPr>
+          <w:ilvl w:val="0"/>
           <w:numId w:val="0"/>
         </w:numPr>
         <w:ind w:leftChars="0"/>
@@ -3459,6 +3449,7 @@
           <w:p>
             <w:pPr>
               <w:numPr>
+                <w:ilvl w:val="0"/>
                 <w:numId w:val="0"/>
               </w:numPr>
               <w:rPr>
@@ -3577,6 +3568,14 @@
         </w:tc>
       </w:tr>
       <w:tr>
+        <w:tblPrEx>
+          <w:tblCellMar>
+            <w:top w:w="0" w:type="dxa"/>
+            <w:left w:w="108" w:type="dxa"/>
+            <w:bottom w:w="0" w:type="dxa"/>
+            <w:right w:w="108" w:type="dxa"/>
+          </w:tblCellMar>
+        </w:tblPrEx>
         <w:tc>
           <w:tcPr>
             <w:tcW w:w="9576" w:type="dxa"/>
@@ -4675,6 +4674,14 @@
         <w:gridCol w:w="9576"/>
       </w:tblGrid>
       <w:tr>
+        <w:tblPrEx>
+          <w:tblCellMar>
+            <w:top w:w="0" w:type="dxa"/>
+            <w:left w:w="108" w:type="dxa"/>
+            <w:bottom w:w="0" w:type="dxa"/>
+            <w:right w:w="108" w:type="dxa"/>
+          </w:tblCellMar>
+        </w:tblPrEx>
         <w:trPr>
           <w:tblHeader/>
         </w:trPr>
@@ -7187,8 +7194,6 @@
                 <w:lang w:val="ru-RU"/>
               </w:rPr>
             </w:pPr>
-            <w:bookmarkStart w:id="1" w:name="_GoBack"/>
-            <w:bookmarkEnd w:id="1"/>
             <w:r>
               <w:rPr>
                 <w:rFonts w:hint="default" w:ascii="Times New Roman" w:hAnsi="Times New Roman" w:cs="Times New Roman"/>
@@ -7917,7 +7922,7 @@
     <w:lsdException w:uiPriority="99" w:name="HTML Acronym"/>
     <w:lsdException w:uiPriority="99" w:name="HTML Address"/>
     <w:lsdException w:uiPriority="99" w:name="HTML Cite"/>
-    <w:lsdException w:uiPriority="99" w:name="HTML Code"/>
+    <w:lsdException w:qFormat="1" w:uiPriority="99" w:name="HTML Code"/>
     <w:lsdException w:uiPriority="99" w:name="HTML Definition"/>
     <w:lsdException w:uiPriority="99" w:name="HTML Keyboard"/>
     <w:lsdException w:uiPriority="99" w:name="HTML Preformatted"/>
@@ -8304,6 +8309,7 @@
     <w:basedOn w:val="11"/>
     <w:semiHidden/>
     <w:unhideWhenUsed/>
+    <w:qFormat/>
     <w:uiPriority w:val="99"/>
     <w:rPr>
       <w:rFonts w:hint="default" w:ascii="Courier New" w:hAnsi="Courier New" w:cs="Courier New" w:eastAsiaTheme="minorEastAsia"/>

</xml_diff>